<commit_message>
Revise the Yılpack ÇED summary from the correct facility document.
Replace the earlier draft with company name, address, process, emission stack, OSB wastewater, and waste codes taken from the submitted iş akım şeması ve proses özeti.

Co-authored-by: iremalisan <iremalisan@users.noreply.github.com>
</commit_message>
<xml_diff>
--- a/ced-basvuru/yilpack/YILPACK_Proje_Ozeti_ve_Is_Akim_Semasi.docx
+++ b/ced-basvuru/yilpack/YILPACK_Proje_Ozeti_ve_Is_Akim_Semasi.docx
@@ -41,20 +41,10 @@
       <w:r>
         <w:rPr>
           <w:rFonts w:ascii="Times New Roman" w:hAnsi="Times New Roman" w:eastAsia="Times New Roman"/>
-          <w:b/>
-          <w:color w:val="C00000"/>
-          <w:sz w:val="22"/>
-          <w:highlight w:val="yellow"/>
-        </w:rPr>
-        <w:t>TESİS ADRESİNİ YAZINIZ</w:t>
-      </w:r>
-      <w:r>
-        <w:rPr>
-          <w:rFonts w:ascii="Times New Roman" w:hAnsi="Times New Roman" w:eastAsia="Times New Roman"/>
           <w:b w:val="0"/>
           <w:sz w:val="22"/>
         </w:rPr>
-        <w:t xml:space="preserve"> adresinde, “Polietilen Poşet, Rafya İplik, Dokuma, Laminasyon (Kömür Torbası) ve Gübre Torbası Üretimi” faaliyetleri yapılması planlanmaktadır.</w:t>
+        <w:t>Adana İli, Sarıçam İlçesi, Acıdere OSB Mh. İnönü Blv. No:15 adresinde, “Tekstilden Çuval, P.P. den Mamül Çuval, Lamineli Çuval, PE Poşet Üretimi” faaliyetleri yapılması planlanmaktadır.</w:t>
       </w:r>
     </w:p>
     <w:p>
@@ -84,7 +74,7 @@
           <w:b w:val="0"/>
           <w:sz w:val="22"/>
         </w:rPr>
-        <w:t>Polietilen poşet, rafya iplik, dokuma, laminasyon (kömür torbaları) ve gübre torbası üretim faaliyetleri yapılması planlanmaktadır. Aşağıda proses özeti belirtilmiştir.</w:t>
+        <w:t>Tekstilden Çuval, P.P. den Mamül Çuval, Lamineli Çuval, PE Poşet Üretimi faaliyetleri yapılması planlanmaktadır. Aşağıda proses özeti belirtilmiştir.</w:t>
       </w:r>
     </w:p>
     <w:p>
@@ -99,7 +89,7 @@
           <w:b/>
           <w:sz w:val="22"/>
         </w:rPr>
-        <w:t>Polietilen Poşet, Rafya İplik, Dokuma ve Torba Üretimi;</w:t>
+        <w:t>Tekstilden Çuval, P.P. den Mamül Çuval, Lamineli Çuval, PE Poşet Üretimi;</w:t>
       </w:r>
     </w:p>
     <w:p>
@@ -114,7 +104,7 @@
           <w:b w:val="0"/>
           <w:sz w:val="22"/>
         </w:rPr>
-        <w:t>Firmanın işyerinde polietilen poşet, rafya iplik, dokuma kumaş, kömür torbası ve gübre torbası üretimi yapılmaktadır. Tesise gelen hammaddeler ilk olarak kantardan geçmekte olup tartım işlemi yapılmaktadır. Tartım işleminden sonra hammaddeler extruder hattında rafya iplik üretimine alınmaktadır. Üretilen iplikler dokuma ünitesinde kumaş haline getirilmektedir.</w:t>
+        <w:t>Firmanın işyerinde tekstilden çuval, P.P. den mamül çuval, lamineli çuval ve PE poşet üretimi yapılmaktadır. Üretimde kullanılacak hammaddeler (PP, PE, Kalsit vb.) hammadde deposuna stoklanır. PP hammadde ve katkı maddeleri dozajlama ünitesinde karıştırılıp extruder makinesinde istenilen ebat ve kalınlıkta iplik haline getirilir. Üretilen PP ipler yuvarlak dokuma makinelerinde hortum kumaş olarak dokunur. Dokunan kumaşlar rulo halinde yarı mamül stok alanına alınır.</w:t>
       </w:r>
     </w:p>
     <w:p>
@@ -129,7 +119,7 @@
           <w:b w:val="0"/>
           <w:sz w:val="22"/>
         </w:rPr>
-        <w:t>Dokuma sonrası ürünler polietilen poşet üretimi, laminasyon (kömür torbaları) ve baskısız kumaş olarak konfeksiyon hatlarına yönlendirilmektedir. Laminasyon sonrası ürünler baskılı veya baskısız olarak konfeksiyon işlemine alınmaktadır. Konfeksiyon sonrası paketleme / ambalaj işlemi yapılmakta; gübre torbası için iç geçirme işlemi uygulanan ürünler ile birlikte sevkiyat gerçekleştirilmektedir.</w:t>
+        <w:t>Dokumadan çıkan kumaşlar müşteri talebine göre laminasyon ve baskı işlemine alınır. Baskı ve lamine işleminden geçen kumaşlar talep edilen boylarda kesilerek çuval haline getirilir. Çuvallar preslenerek balyalar halinde paketlenir, paletler üzerinde stoklanır ve sevkiyatı gerçekleştirilir.</w:t>
       </w:r>
     </w:p>
     <w:p>
@@ -159,7 +149,7 @@
           <w:b w:val="0"/>
           <w:sz w:val="22"/>
         </w:rPr>
-        <w:t>Tesiste çalışan personelden dolayı oluşacak atıksular, Belediyeye ait kanalizasyon sistemine verilmektedir. Tesiste endüstriyel nitelikli herhangi bir atıksu oluşmayacaktır.</w:t>
+        <w:t>Tesiste personelden kaynaklı evsel nitelikli atıksu oluşmakta olup endüstriyel nitelikli atıksu oluşmamaktadır. Oluşan evsel nitelikli atıksular, OSB kanalizasyon sistemine verilmektedir.</w:t>
       </w:r>
     </w:p>
     <w:p>
@@ -189,7 +179,7 @@
           <w:b w:val="0"/>
           <w:sz w:val="22"/>
         </w:rPr>
-        <w:t>Tesiste ısınma ve sanayi amaçlı olarak elektrik enerjisi kullanılacaktır. Tesiste herhangi bir emisyon kaynağı olduğu taktirde SKHKKY hükümleri çerçevesinde gerekli ölçümler yaptırılıp söz konusu yönetmelikte belirtilen sınır değerleri sağlanacak, Çevre ve Şehircilik İl Müdürlüğü’ne bilgi verilecektir.</w:t>
+        <w:t>Tesiste baskı makinesinde boya kullanılmakta olup lamine çuvalların üstüne kaplama işlemi yapılmaktadır. Baskı ve lamina makinelerinden kaynaklı bacalar tesis içerisinde birleşerek bir adet emisyon çıkış bacası olarak dışarıya verilmektedir. Bahse konu makinelerde yakıt olarak elektrik enerjisi kullanılmaktadır. Tesiste herhangi bir emisyon kaynağı olduğu taktirde SKHKKY hükümleri çerçevesinde gerekli ölçümler yaptırılıp söz konusu yönetmelikte belirtilen sınır değerleri sağlanacak, Çevre ve Şehircilik İl Müdürlüğü’ne bilgi verilecektir.</w:t>
       </w:r>
     </w:p>
     <w:p>
@@ -312,6 +302,61 @@
                 <w:b/>
                 <w:sz w:val="18"/>
               </w:rPr>
+              <w:t>15 02 02*</w:t>
+            </w:r>
+          </w:p>
+        </w:tc>
+        <w:tc>
+          <w:tcPr>
+            <w:tcW w:type="dxa" w:w="7824"/>
+            <w:tcBorders>
+              <w:top w:val="single" w:sz="4" w:space="0" w:color="7F7F7F"/>
+              <w:left w:val="single" w:sz="4" w:space="0" w:color="7F7F7F"/>
+              <w:bottom w:val="single" w:sz="4" w:space="0" w:color="7F7F7F"/>
+              <w:right w:val="single" w:sz="4" w:space="0" w:color="7F7F7F"/>
+            </w:tcBorders>
+          </w:tcPr>
+          <w:p>
+            <w:pPr>
+              <w:spacing w:before="40" w:after="40" w:line="240" w:lineRule="exact"/>
+              <w:jc w:val="left"/>
+            </w:pPr>
+            <w:r/>
+            <w:r>
+              <w:rPr>
+                <w:rFonts w:ascii="Times New Roman" w:hAnsi="Times New Roman" w:eastAsia="Times New Roman"/>
+                <w:b w:val="0"/>
+                <w:sz w:val="18"/>
+              </w:rPr>
+              <w:t>Tehlikeli maddelerle kirlenmiş emiciler, filtre malzemeleri (başka şekilde tanımlanmamış ise yağ filtreleri), temizleme bezleri, koruyucu giysiler</w:t>
+            </w:r>
+          </w:p>
+        </w:tc>
+      </w:tr>
+      <w:tr>
+        <w:tc>
+          <w:tcPr>
+            <w:tcW w:type="dxa" w:w="1814"/>
+            <w:shd w:fill="F2F2F2" w:val="clear"/>
+            <w:tcBorders>
+              <w:top w:val="single" w:sz="4" w:space="0" w:color="7F7F7F"/>
+              <w:left w:val="single" w:sz="4" w:space="0" w:color="7F7F7F"/>
+              <w:bottom w:val="single" w:sz="4" w:space="0" w:color="7F7F7F"/>
+              <w:right w:val="single" w:sz="4" w:space="0" w:color="7F7F7F"/>
+            </w:tcBorders>
+          </w:tcPr>
+          <w:p>
+            <w:pPr>
+              <w:spacing w:before="40" w:after="40" w:line="240" w:lineRule="exact"/>
+              <w:jc w:val="center"/>
+            </w:pPr>
+            <w:r/>
+            <w:r>
+              <w:rPr>
+                <w:rFonts w:ascii="Times New Roman" w:hAnsi="Times New Roman" w:eastAsia="Times New Roman"/>
+                <w:b/>
+                <w:sz w:val="18"/>
+              </w:rPr>
               <w:t>15 01 10*</w:t>
             </w:r>
           </w:p>
@@ -319,6 +364,7 @@
         <w:tc>
           <w:tcPr>
             <w:tcW w:type="dxa" w:w="7824"/>
+            <w:shd w:fill="F2F2F2" w:val="clear"/>
             <w:tcBorders>
               <w:top w:val="single" w:sz="4" w:space="0" w:color="7F7F7F"/>
               <w:left w:val="single" w:sz="4" w:space="0" w:color="7F7F7F"/>
@@ -347,7 +393,6 @@
         <w:tc>
           <w:tcPr>
             <w:tcW w:type="dxa" w:w="1814"/>
-            <w:shd w:fill="F2F2F2" w:val="clear"/>
             <w:tcBorders>
               <w:top w:val="single" w:sz="4" w:space="0" w:color="7F7F7F"/>
               <w:left w:val="single" w:sz="4" w:space="0" w:color="7F7F7F"/>
@@ -367,62 +412,7 @@
                 <w:b/>
                 <w:sz w:val="18"/>
               </w:rPr>
-              <w:t>15 02 02*</w:t>
-            </w:r>
-          </w:p>
-        </w:tc>
-        <w:tc>
-          <w:tcPr>
-            <w:tcW w:type="dxa" w:w="7824"/>
-            <w:shd w:fill="F2F2F2" w:val="clear"/>
-            <w:tcBorders>
-              <w:top w:val="single" w:sz="4" w:space="0" w:color="7F7F7F"/>
-              <w:left w:val="single" w:sz="4" w:space="0" w:color="7F7F7F"/>
-              <w:bottom w:val="single" w:sz="4" w:space="0" w:color="7F7F7F"/>
-              <w:right w:val="single" w:sz="4" w:space="0" w:color="7F7F7F"/>
-            </w:tcBorders>
-          </w:tcPr>
-          <w:p>
-            <w:pPr>
-              <w:spacing w:before="40" w:after="40" w:line="240" w:lineRule="exact"/>
-              <w:jc w:val="left"/>
-            </w:pPr>
-            <w:r/>
-            <w:r>
-              <w:rPr>
-                <w:rFonts w:ascii="Times New Roman" w:hAnsi="Times New Roman" w:eastAsia="Times New Roman"/>
-                <w:b w:val="0"/>
-                <w:sz w:val="18"/>
-              </w:rPr>
-              <w:t>Tehlikeli maddelerle kirlenmiş emiciler, filtre malzemeleri (başka şekilde tanımlanmamış ise yağ filtreleri), temizleme bezleri, koruyucu giysiler</w:t>
-            </w:r>
-          </w:p>
-        </w:tc>
-      </w:tr>
-      <w:tr>
-        <w:tc>
-          <w:tcPr>
-            <w:tcW w:type="dxa" w:w="1814"/>
-            <w:tcBorders>
-              <w:top w:val="single" w:sz="4" w:space="0" w:color="7F7F7F"/>
-              <w:left w:val="single" w:sz="4" w:space="0" w:color="7F7F7F"/>
-              <w:bottom w:val="single" w:sz="4" w:space="0" w:color="7F7F7F"/>
-              <w:right w:val="single" w:sz="4" w:space="0" w:color="7F7F7F"/>
-            </w:tcBorders>
-          </w:tcPr>
-          <w:p>
-            <w:pPr>
-              <w:spacing w:before="40" w:after="40" w:line="240" w:lineRule="exact"/>
-              <w:jc w:val="center"/>
-            </w:pPr>
-            <w:r/>
-            <w:r>
-              <w:rPr>
-                <w:rFonts w:ascii="Times New Roman" w:hAnsi="Times New Roman" w:eastAsia="Times New Roman"/>
-                <w:b/>
-                <w:sz w:val="18"/>
-              </w:rPr>
-              <w:t>20 01 21*</w:t>
+              <w:t>12 01 09*</w:t>
             </w:r>
           </w:p>
         </w:tc>
@@ -448,7 +438,7 @@
                 <w:b w:val="0"/>
                 <w:sz w:val="18"/>
               </w:rPr>
-              <w:t>Fluoresan lambalar ve diğer cıva içeren atıklar</w:t>
+              <w:t>Halojen içermeyen işleme emülsiyon ve solüsyonları</w:t>
             </w:r>
           </w:p>
         </w:tc>
@@ -477,7 +467,7 @@
                 <w:b/>
                 <w:sz w:val="18"/>
               </w:rPr>
-              <w:t>20 01 08</w:t>
+              <w:t>15 01 01</w:t>
             </w:r>
           </w:p>
         </w:tc>
@@ -504,7 +494,227 @@
                 <w:b w:val="0"/>
                 <w:sz w:val="18"/>
               </w:rPr>
-              <w:t>Biyolojik olarak bozunabilir mutfak ve kantin atıkları</w:t>
+              <w:t>Kağıt ve karton ambalaj</w:t>
+            </w:r>
+          </w:p>
+        </w:tc>
+      </w:tr>
+      <w:tr>
+        <w:tc>
+          <w:tcPr>
+            <w:tcW w:type="dxa" w:w="1814"/>
+            <w:tcBorders>
+              <w:top w:val="single" w:sz="4" w:space="0" w:color="7F7F7F"/>
+              <w:left w:val="single" w:sz="4" w:space="0" w:color="7F7F7F"/>
+              <w:bottom w:val="single" w:sz="4" w:space="0" w:color="7F7F7F"/>
+              <w:right w:val="single" w:sz="4" w:space="0" w:color="7F7F7F"/>
+            </w:tcBorders>
+          </w:tcPr>
+          <w:p>
+            <w:pPr>
+              <w:spacing w:before="40" w:after="40" w:line="240" w:lineRule="exact"/>
+              <w:jc w:val="center"/>
+            </w:pPr>
+            <w:r/>
+            <w:r>
+              <w:rPr>
+                <w:rFonts w:ascii="Times New Roman" w:hAnsi="Times New Roman" w:eastAsia="Times New Roman"/>
+                <w:b/>
+                <w:sz w:val="18"/>
+              </w:rPr>
+              <w:t>20 01 33*</w:t>
+            </w:r>
+          </w:p>
+        </w:tc>
+        <w:tc>
+          <w:tcPr>
+            <w:tcW w:type="dxa" w:w="7824"/>
+            <w:tcBorders>
+              <w:top w:val="single" w:sz="4" w:space="0" w:color="7F7F7F"/>
+              <w:left w:val="single" w:sz="4" w:space="0" w:color="7F7F7F"/>
+              <w:bottom w:val="single" w:sz="4" w:space="0" w:color="7F7F7F"/>
+              <w:right w:val="single" w:sz="4" w:space="0" w:color="7F7F7F"/>
+            </w:tcBorders>
+          </w:tcPr>
+          <w:p>
+            <w:pPr>
+              <w:spacing w:before="40" w:after="40" w:line="240" w:lineRule="exact"/>
+              <w:jc w:val="left"/>
+            </w:pPr>
+            <w:r/>
+            <w:r>
+              <w:rPr>
+                <w:rFonts w:ascii="Times New Roman" w:hAnsi="Times New Roman" w:eastAsia="Times New Roman"/>
+                <w:b w:val="0"/>
+                <w:sz w:val="18"/>
+              </w:rPr>
+              <w:t>16 06 01, 16 06 02 veya 16 06 03’un altında geçen pil ve akümülatörler ve bu pilleri içeren sınıflandırılmamış karışık pil ve akümülatörler</w:t>
+            </w:r>
+          </w:p>
+        </w:tc>
+      </w:tr>
+      <w:tr>
+        <w:tc>
+          <w:tcPr>
+            <w:tcW w:type="dxa" w:w="1814"/>
+            <w:shd w:fill="F2F2F2" w:val="clear"/>
+            <w:tcBorders>
+              <w:top w:val="single" w:sz="4" w:space="0" w:color="7F7F7F"/>
+              <w:left w:val="single" w:sz="4" w:space="0" w:color="7F7F7F"/>
+              <w:bottom w:val="single" w:sz="4" w:space="0" w:color="7F7F7F"/>
+              <w:right w:val="single" w:sz="4" w:space="0" w:color="7F7F7F"/>
+            </w:tcBorders>
+          </w:tcPr>
+          <w:p>
+            <w:pPr>
+              <w:spacing w:before="40" w:after="40" w:line="240" w:lineRule="exact"/>
+              <w:jc w:val="center"/>
+            </w:pPr>
+            <w:r/>
+            <w:r>
+              <w:rPr>
+                <w:rFonts w:ascii="Times New Roman" w:hAnsi="Times New Roman" w:eastAsia="Times New Roman"/>
+                <w:b/>
+                <w:sz w:val="18"/>
+              </w:rPr>
+              <w:t>20 01 21*</w:t>
+            </w:r>
+          </w:p>
+        </w:tc>
+        <w:tc>
+          <w:tcPr>
+            <w:tcW w:type="dxa" w:w="7824"/>
+            <w:shd w:fill="F2F2F2" w:val="clear"/>
+            <w:tcBorders>
+              <w:top w:val="single" w:sz="4" w:space="0" w:color="7F7F7F"/>
+              <w:left w:val="single" w:sz="4" w:space="0" w:color="7F7F7F"/>
+              <w:bottom w:val="single" w:sz="4" w:space="0" w:color="7F7F7F"/>
+              <w:right w:val="single" w:sz="4" w:space="0" w:color="7F7F7F"/>
+            </w:tcBorders>
+          </w:tcPr>
+          <w:p>
+            <w:pPr>
+              <w:spacing w:before="40" w:after="40" w:line="240" w:lineRule="exact"/>
+              <w:jc w:val="left"/>
+            </w:pPr>
+            <w:r/>
+            <w:r>
+              <w:rPr>
+                <w:rFonts w:ascii="Times New Roman" w:hAnsi="Times New Roman" w:eastAsia="Times New Roman"/>
+                <w:b w:val="0"/>
+                <w:sz w:val="18"/>
+              </w:rPr>
+              <w:t>Flüoresan lambalar ve diğer cıva içeren atıklar</w:t>
+            </w:r>
+          </w:p>
+        </w:tc>
+      </w:tr>
+      <w:tr>
+        <w:tc>
+          <w:tcPr>
+            <w:tcW w:type="dxa" w:w="1814"/>
+            <w:tcBorders>
+              <w:top w:val="single" w:sz="4" w:space="0" w:color="7F7F7F"/>
+              <w:left w:val="single" w:sz="4" w:space="0" w:color="7F7F7F"/>
+              <w:bottom w:val="single" w:sz="4" w:space="0" w:color="7F7F7F"/>
+              <w:right w:val="single" w:sz="4" w:space="0" w:color="7F7F7F"/>
+            </w:tcBorders>
+          </w:tcPr>
+          <w:p>
+            <w:pPr>
+              <w:spacing w:before="40" w:after="40" w:line="240" w:lineRule="exact"/>
+              <w:jc w:val="center"/>
+            </w:pPr>
+            <w:r/>
+            <w:r>
+              <w:rPr>
+                <w:rFonts w:ascii="Times New Roman" w:hAnsi="Times New Roman" w:eastAsia="Times New Roman"/>
+                <w:b/>
+                <w:sz w:val="18"/>
+              </w:rPr>
+              <w:t>08 01 11*</w:t>
+            </w:r>
+          </w:p>
+        </w:tc>
+        <w:tc>
+          <w:tcPr>
+            <w:tcW w:type="dxa" w:w="7824"/>
+            <w:tcBorders>
+              <w:top w:val="single" w:sz="4" w:space="0" w:color="7F7F7F"/>
+              <w:left w:val="single" w:sz="4" w:space="0" w:color="7F7F7F"/>
+              <w:bottom w:val="single" w:sz="4" w:space="0" w:color="7F7F7F"/>
+              <w:right w:val="single" w:sz="4" w:space="0" w:color="7F7F7F"/>
+            </w:tcBorders>
+          </w:tcPr>
+          <w:p>
+            <w:pPr>
+              <w:spacing w:before="40" w:after="40" w:line="240" w:lineRule="exact"/>
+              <w:jc w:val="left"/>
+            </w:pPr>
+            <w:r/>
+            <w:r>
+              <w:rPr>
+                <w:rFonts w:ascii="Times New Roman" w:hAnsi="Times New Roman" w:eastAsia="Times New Roman"/>
+                <w:b w:val="0"/>
+                <w:sz w:val="18"/>
+              </w:rPr>
+              <w:t>Organik çözücüler ya da diğer tehlikeli maddeler içeren atık boya ve vernikler</w:t>
+            </w:r>
+          </w:p>
+        </w:tc>
+      </w:tr>
+      <w:tr>
+        <w:tc>
+          <w:tcPr>
+            <w:tcW w:type="dxa" w:w="1814"/>
+            <w:shd w:fill="F2F2F2" w:val="clear"/>
+            <w:tcBorders>
+              <w:top w:val="single" w:sz="4" w:space="0" w:color="7F7F7F"/>
+              <w:left w:val="single" w:sz="4" w:space="0" w:color="7F7F7F"/>
+              <w:bottom w:val="single" w:sz="4" w:space="0" w:color="7F7F7F"/>
+              <w:right w:val="single" w:sz="4" w:space="0" w:color="7F7F7F"/>
+            </w:tcBorders>
+          </w:tcPr>
+          <w:p>
+            <w:pPr>
+              <w:spacing w:before="40" w:after="40" w:line="240" w:lineRule="exact"/>
+              <w:jc w:val="center"/>
+            </w:pPr>
+            <w:r/>
+            <w:r>
+              <w:rPr>
+                <w:rFonts w:ascii="Times New Roman" w:hAnsi="Times New Roman" w:eastAsia="Times New Roman"/>
+                <w:b/>
+                <w:sz w:val="18"/>
+              </w:rPr>
+              <w:t>04 02 16*</w:t>
+            </w:r>
+          </w:p>
+        </w:tc>
+        <w:tc>
+          <w:tcPr>
+            <w:tcW w:type="dxa" w:w="7824"/>
+            <w:shd w:fill="F2F2F2" w:val="clear"/>
+            <w:tcBorders>
+              <w:top w:val="single" w:sz="4" w:space="0" w:color="7F7F7F"/>
+              <w:left w:val="single" w:sz="4" w:space="0" w:color="7F7F7F"/>
+              <w:bottom w:val="single" w:sz="4" w:space="0" w:color="7F7F7F"/>
+              <w:right w:val="single" w:sz="4" w:space="0" w:color="7F7F7F"/>
+            </w:tcBorders>
+          </w:tcPr>
+          <w:p>
+            <w:pPr>
+              <w:spacing w:before="40" w:after="40" w:line="240" w:lineRule="exact"/>
+              <w:jc w:val="left"/>
+            </w:pPr>
+            <w:r/>
+            <w:r>
+              <w:rPr>
+                <w:rFonts w:ascii="Times New Roman" w:hAnsi="Times New Roman" w:eastAsia="Times New Roman"/>
+                <w:b w:val="0"/>
+                <w:sz w:val="18"/>
+              </w:rPr>
+              <w:t>Tehlikeli maddeler içeren boya maddeleri ve pigmentler</w:t>
             </w:r>
           </w:p>
         </w:tc>
@@ -523,21 +733,6 @@
           <w:sz w:val="22"/>
         </w:rPr>
         <w:t>Tehlikeli olmayan atıklar, Çevre, Şehircilik ve İklim Değişikliği Bakanlığı’ndan yetki almış geri dönüşüm/kazanım firmalarına verilecektir. Oluşabilecek tehlikeli atıklar ise, Çevre, Şehircilik ve İklim Değişikliği Bakanlığı’ndan yetki almış bertaraf/geri kazanım tesislerine gönderilecek ve bertarafı sağlanacaktır.</w:t>
-      </w:r>
-    </w:p>
-    <w:p>
-      <w:pPr>
-        <w:spacing w:before="0" w:after="120" w:line="320" w:lineRule="exact"/>
-        <w:ind w:firstLine="283"/>
-        <w:jc w:val="both"/>
-      </w:pPr>
-      <w:r>
-        <w:rPr>
-          <w:rFonts w:ascii="Times New Roman" w:hAnsi="Times New Roman" w:eastAsia="Times New Roman"/>
-          <w:b w:val="0"/>
-          <w:sz w:val="22"/>
-        </w:rPr>
-        <w:t>Tesiste oluşacak evsel atıkların bertarafı, Belediye tarafından sağlanacaktır.</w:t>
       </w:r>
     </w:p>
     <w:p>
@@ -587,7 +782,7 @@
           <w:b/>
           <w:sz w:val="24"/>
         </w:rPr>
-        <w:t>YILPACK</w:t>
+        <w:t>YILPACK AMBALAJ SAN. TİC. A.Ş. ADANA ŞB.</w:t>
       </w:r>
     </w:p>
     <w:p>
@@ -600,9 +795,9 @@
         <w:rPr>
           <w:rFonts w:ascii="Times New Roman" w:hAnsi="Times New Roman" w:eastAsia="Times New Roman"/>
           <w:b/>
-          <w:sz w:val="24"/>
+          <w:sz w:val="22"/>
         </w:rPr>
-        <w:t>POLİETİLEN POŞET, RAFYA İPLİK, DOKUMA VE TORBA ÜRETİM TESİSİ</w:t>
+        <w:t>TEKSTİLDEN ÇUVAL, P.P. DEN MAMÜL ÇUVAL, LAMİNELİ ÇUVAL, PE POŞET ÜRETİMİ</w:t>
       </w:r>
     </w:p>
     <w:p>

</xml_diff>